<commit_message>
lidar and power notes
</commit_message>
<xml_diff>
--- a/docs/Справочная_информация/3_Доп_ПО.docx
+++ b/docs/Справочная_информация/3_Доп_ПО.docx
@@ -15,8 +15,6 @@
           <w:lang w:val="en-US"/>
         </w:rPr>
       </w:pPr>
-      <w:bookmarkStart w:id="35" w:name="_GoBack"/>
-      <w:bookmarkEnd w:id="35"/>
       <w:r>
         <w:rPr>
           <w:rFonts w:hint="default"/>
@@ -5222,12 +5220,31 @@
             </w:pPr>
             <w:r>
               <w:rPr>
+                <w:b w:val="0"/>
+                <w:sz w:val="26"/>
+                <w:szCs w:val="26"/>
+                <w:lang w:val="ru-RU"/>
+              </w:rPr>
+              <w:t>Запуск</w:t>
+            </w:r>
+            <w:r>
+              <w:rPr>
+                <w:rFonts w:hint="default"/>
+                <w:b w:val="0"/>
+                <w:sz w:val="26"/>
+                <w:szCs w:val="26"/>
+                <w:lang w:val="ru-RU"/>
+              </w:rPr>
+              <w:t xml:space="preserve"> </w:t>
+            </w:r>
+            <w:r>
+              <w:rPr>
                 <w:rFonts w:ascii="Times New Roman" w:hAnsi="Times New Roman"/>
                 <w:b w:val="0"/>
                 <w:sz w:val="26"/>
                 <w:szCs w:val="26"/>
               </w:rPr>
-              <w:t>Проверка сенсоров и моторов</w:t>
+              <w:t>сенсоров и моторов</w:t>
             </w:r>
           </w:p>
         </w:tc>
@@ -5352,18 +5369,74 @@
               <w:ind w:left="0" w:leftChars="0" w:firstLine="0" w:firstLineChars="0"/>
               <w:jc w:val="left"/>
               <w:rPr>
-                <w:sz w:val="26"/>
-                <w:szCs w:val="26"/>
-              </w:rPr>
-            </w:pPr>
-            <w:r>
-              <w:rPr>
                 <w:rFonts w:ascii="Times New Roman" w:hAnsi="Times New Roman"/>
                 <w:b w:val="0"/>
                 <w:sz w:val="26"/>
                 <w:szCs w:val="26"/>
               </w:rPr>
+            </w:pPr>
+            <w:r>
+              <w:rPr>
+                <w:rFonts w:ascii="Times New Roman" w:hAnsi="Times New Roman"/>
+                <w:b w:val="0"/>
+                <w:sz w:val="26"/>
+                <w:szCs w:val="26"/>
+              </w:rPr>
               <w:t>Включает лидар, камеру (опционально), моторы; данные можно наблюдать в Rviz.</w:t>
+            </w:r>
+          </w:p>
+          <w:p>
+            <w:pPr>
+              <w:widowControl w:val="0"/>
+              <w:spacing w:after="0" w:line="240" w:lineRule="auto"/>
+              <w:ind w:left="0" w:leftChars="0" w:firstLine="0" w:firstLineChars="0"/>
+              <w:jc w:val="left"/>
+              <w:rPr>
+                <w:rFonts w:hint="default" w:ascii="Times New Roman" w:hAnsi="Times New Roman"/>
+                <w:b w:val="0"/>
+                <w:sz w:val="26"/>
+                <w:szCs w:val="26"/>
+                <w:lang w:val="ru-RU"/>
+              </w:rPr>
+            </w:pPr>
+            <w:r>
+              <w:rPr>
+                <w:b w:val="0"/>
+                <w:sz w:val="26"/>
+                <w:szCs w:val="26"/>
+                <w:lang w:val="ru-RU"/>
+              </w:rPr>
+              <w:t>При</w:t>
+            </w:r>
+            <w:r>
+              <w:rPr>
+                <w:rFonts w:hint="default"/>
+                <w:b w:val="0"/>
+                <w:sz w:val="26"/>
+                <w:szCs w:val="26"/>
+                <w:lang w:val="ru-RU"/>
+              </w:rPr>
+              <w:t xml:space="preserve"> остановке выполения </w:t>
+            </w:r>
+            <w:r>
+              <w:rPr>
+                <w:rFonts w:hint="default"/>
+                <w:b w:val="0"/>
+                <w:sz w:val="26"/>
+                <w:szCs w:val="26"/>
+                <w:lang w:val="en-US"/>
+              </w:rPr>
+              <w:t>launch</w:t>
+            </w:r>
+            <w:r>
+              <w:rPr>
+                <w:rFonts w:hint="default"/>
+                <w:b w:val="0"/>
+                <w:sz w:val="26"/>
+                <w:szCs w:val="26"/>
+                <w:lang w:val="ru-RU"/>
+              </w:rPr>
+              <w:t>, лидар может продолжить куртиться.</w:t>
             </w:r>
           </w:p>
         </w:tc>
@@ -13202,12 +13275,31 @@
             </w:pPr>
             <w:r>
               <w:rPr>
+                <w:b w:val="0"/>
+                <w:sz w:val="26"/>
+                <w:szCs w:val="26"/>
+                <w:lang w:val="ru-RU"/>
+              </w:rPr>
+              <w:t>Запуск</w:t>
+            </w:r>
+            <w:r>
+              <w:rPr>
+                <w:rFonts w:hint="default"/>
+                <w:b w:val="0"/>
+                <w:sz w:val="26"/>
+                <w:szCs w:val="26"/>
+                <w:lang w:val="ru-RU"/>
+              </w:rPr>
+              <w:t xml:space="preserve"> </w:t>
+            </w:r>
+            <w:r>
+              <w:rPr>
                 <w:rFonts w:ascii="Times New Roman" w:hAnsi="Times New Roman"/>
                 <w:b w:val="0"/>
                 <w:sz w:val="26"/>
                 <w:szCs w:val="26"/>
               </w:rPr>
-              <w:t>Проверка сенсоров и моторов</w:t>
+              <w:t>сенсоров и моторов</w:t>
             </w:r>
           </w:p>
         </w:tc>
@@ -13337,18 +13429,71 @@
               <w:ind w:left="0" w:leftChars="0" w:firstLine="0" w:firstLineChars="0"/>
               <w:jc w:val="left"/>
               <w:rPr>
-                <w:sz w:val="26"/>
-                <w:szCs w:val="26"/>
-              </w:rPr>
-            </w:pPr>
-            <w:r>
-              <w:rPr>
                 <w:rFonts w:ascii="Times New Roman" w:hAnsi="Times New Roman"/>
                 <w:b w:val="0"/>
                 <w:sz w:val="26"/>
                 <w:szCs w:val="26"/>
               </w:rPr>
+            </w:pPr>
+            <w:r>
+              <w:rPr>
+                <w:rFonts w:ascii="Times New Roman" w:hAnsi="Times New Roman"/>
+                <w:b w:val="0"/>
+                <w:sz w:val="26"/>
+                <w:szCs w:val="26"/>
+              </w:rPr>
               <w:t>Включает лидар, камеру (опционально), моторы; данные можно наблюдать в Rviz.</w:t>
+            </w:r>
+          </w:p>
+          <w:p>
+            <w:pPr>
+              <w:widowControl w:val="0"/>
+              <w:spacing w:after="0" w:line="240" w:lineRule="auto"/>
+              <w:ind w:left="0" w:leftChars="0" w:firstLine="0" w:firstLineChars="0"/>
+              <w:jc w:val="left"/>
+              <w:rPr>
+                <w:sz w:val="26"/>
+                <w:szCs w:val="26"/>
+              </w:rPr>
+            </w:pPr>
+            <w:r>
+              <w:rPr>
+                <w:b w:val="0"/>
+                <w:sz w:val="26"/>
+                <w:szCs w:val="26"/>
+                <w:lang w:val="ru-RU"/>
+              </w:rPr>
+              <w:t>При</w:t>
+            </w:r>
+            <w:r>
+              <w:rPr>
+                <w:rFonts w:hint="default"/>
+                <w:b w:val="0"/>
+                <w:sz w:val="26"/>
+                <w:szCs w:val="26"/>
+                <w:lang w:val="ru-RU"/>
+              </w:rPr>
+              <w:t xml:space="preserve"> остановке выполения </w:t>
+            </w:r>
+            <w:r>
+              <w:rPr>
+                <w:rFonts w:hint="default"/>
+                <w:b w:val="0"/>
+                <w:sz w:val="26"/>
+                <w:szCs w:val="26"/>
+                <w:lang w:val="en-US"/>
+              </w:rPr>
+              <w:t>launch</w:t>
+            </w:r>
+            <w:r>
+              <w:rPr>
+                <w:rFonts w:hint="default"/>
+                <w:b w:val="0"/>
+                <w:sz w:val="26"/>
+                <w:szCs w:val="26"/>
+                <w:lang w:val="ru-RU"/>
+              </w:rPr>
+              <w:t>, лидар может продолжить куртиться.</w:t>
             </w:r>
           </w:p>
         </w:tc>
@@ -14429,14 +14574,14 @@
           <w:rFonts w:hint="default"/>
           <w:lang w:val="ru-RU"/>
         </w:rPr>
-        <w:t xml:space="preserve"> Предназначени для запуска непосредственно на вычислителе робота, к котрому подключены перечисленные </w:t>
-      </w:r>
-      <w:r>
-        <w:rPr>
-          <w:rFonts w:hint="default"/>
-          <w:lang w:val="en-US"/>
-        </w:rPr>
-        <w:t>Основные запускаемые подсистемы:</w:t>
+        <w:t xml:space="preserve"> Предназначени для запуска непосредственно на вычислителе робота, к которому подключены перечисленные о</w:t>
+      </w:r>
+      <w:r>
+        <w:rPr>
+          <w:rFonts w:hint="default"/>
+          <w:lang w:val="en-US"/>
+        </w:rPr>
+        <w:t>сновные запускаемые подсистемы:</w:t>
       </w:r>
     </w:p>
     <w:p>
@@ -14517,6 +14662,53 @@
           <w:lang w:val="en-US"/>
         </w:rPr>
         <w:t>Также добавляется статический трансформ между фреймами камеры (аналогично предыдущему файлу) при включённой камере.</w:t>
+      </w:r>
+    </w:p>
+    <w:p>
+      <w:pPr>
+        <w:ind w:left="0" w:leftChars="0" w:firstLine="720" w:firstLineChars="0"/>
+        <w:rPr>
+          <w:rFonts w:hint="default"/>
+          <w:i/>
+          <w:iCs/>
+          <w:lang w:val="ru-RU"/>
+        </w:rPr>
+      </w:pPr>
+      <w:r>
+        <w:rPr>
+          <w:rFonts w:hint="default"/>
+          <w:lang w:val="ru-RU"/>
+        </w:rPr>
+        <w:t>*</w:t>
+      </w:r>
+      <w:bookmarkStart w:id="35" w:name="_GoBack"/>
+      <w:bookmarkEnd w:id="35"/>
+      <w:r>
+        <w:rPr>
+          <w:rFonts w:hint="default"/>
+          <w:i/>
+          <w:iCs/>
+          <w:lang w:val="ru-RU"/>
+        </w:rPr>
+        <w:t xml:space="preserve">При остановке выполнения этого </w:t>
+      </w:r>
+      <w:r>
+        <w:rPr>
+          <w:rFonts w:hint="default"/>
+          <w:i/>
+          <w:iCs/>
+          <w:lang w:val="en-US"/>
+        </w:rPr>
+        <w:t>launch-</w:t>
+      </w:r>
+      <w:r>
+        <w:rPr>
+          <w:rFonts w:hint="default"/>
+          <w:i/>
+          <w:iCs/>
+          <w:lang w:val="ru-RU"/>
+        </w:rPr>
+        <w:t>файла лидар может продолжить крутиться.</w:t>
       </w:r>
     </w:p>
     <w:p>
@@ -15472,8 +15664,8 @@
         <w:ind w:left="0" w:leftChars="0" w:firstLine="0" w:firstLineChars="0"/>
         <w:jc w:val="center"/>
       </w:pPr>
-      <w:bookmarkStart w:id="27" w:name="_Toc540280343"/>
-      <w:bookmarkStart w:id="28" w:name="_Toc1302352556"/>
+      <w:bookmarkStart w:id="27" w:name="_Toc1302352556"/>
+      <w:bookmarkStart w:id="28" w:name="_Toc540280343"/>
     </w:p>
     <w:p>
       <w:pPr>
@@ -16941,8 +17133,8 @@
         </w:rPr>
       </w:pPr>
       <w:bookmarkStart w:id="32" w:name="_Toc12266"/>
-      <w:bookmarkStart w:id="33" w:name="_Toc258464778"/>
-      <w:bookmarkStart w:id="34" w:name="_Toc32683"/>
+      <w:bookmarkStart w:id="33" w:name="_Toc32683"/>
+      <w:bookmarkStart w:id="34" w:name="_Toc258464778"/>
       <w:r>
         <w:rPr>
           <w:rFonts w:hint="default" w:ascii="Times New Roman" w:hAnsi="Times New Roman" w:eastAsiaTheme="minorEastAsia" w:cstheme="minorBidi"/>
@@ -17207,6 +17399,12 @@
             <w:insideH w:val="single" w:color="auto" w:sz="4" w:space="0"/>
             <w:insideV w:val="single" w:color="auto" w:sz="4" w:space="0"/>
           </w:tblBorders>
+          <w:tblCellMar>
+            <w:top w:w="0" w:type="dxa"/>
+            <w:left w:w="108" w:type="dxa"/>
+            <w:bottom w:w="0" w:type="dxa"/>
+            <w:right w:w="108" w:type="dxa"/>
+          </w:tblCellMar>
         </w:tblPrEx>
         <w:tc>
           <w:tcPr>

</xml_diff>